<commit_message>
Fix slide 7 confusion-matrix figure and remove em dashes
Slide 7 (Taoglas vs. mixed pair): regenerated fig13 to drop the "n="
caption line and widen panel spacing so "Actual activity" no longer
overlaps the neighboring panel; swapped only that image in the live
pptx (byte-level, preserving all other hand-made edits to the deck).

Removed em dashes across this week's deliverables (pptx text runs,
talking points, and the two standing docx reports), substituting
colons/semicolons/commas per sentence. Builder scripts updated at the
source so future regenerations stay consistent.

Co-Authored-By: Claude Sonnet 5 <noreply@anthropic.com>
</commit_message>
<xml_diff>
--- a/docs/CSI_Model_Comparison.docx
+++ b/docs/CSI_Model_Comparison.docx
@@ -15,7 +15,7 @@
           <w:color w:val="000000"/>
           <w:sz w:val="32"/>
         </w:rPr>
-        <w:t>Wi-Fi CSI Sensing — Model Comparison</w:t>
+        <w:t>Wi-Fi CSI Sensing: Model Comparison</w:t>
       </w:r>
     </w:p>
     <w:p>
@@ -92,7 +92,7 @@
           <w:color w:val="000000"/>
           <w:sz w:val="24"/>
         </w:rPr>
-        <w:t>Two input representations were compared. The eight classical models receive the same 160 hand-crafted features per window used by the current pipeline. The two deep networks instead receive the raw calibrated window (52 subcarriers x 200 samples) and learn their own features end-to-end — this is the fairest test of whether deep learning helps here.</w:t>
+        <w:t>Two input representations were compared. The eight classical models receive the same 160 hand-crafted features per window used by the current pipeline. The two deep networks instead receive the raw calibrated window (52 subcarriers x 200 samples) and learn their own features end-to-end: this is the fairest test of whether deep learning helps here.</w:t>
       </w:r>
     </w:p>
     <w:p>
@@ -329,7 +329,7 @@
                 <w:color w:val="000000"/>
                 <w:sz w:val="20"/>
               </w:rPr>
-              <w:t>—</w:t>
+              <w:t>N/A</w:t>
             </w:r>
           </w:p>
         </w:tc>
@@ -1247,7 +1247,7 @@
                 <w:color w:val="000000"/>
                 <w:sz w:val="20"/>
               </w:rPr>
-              <w:t>—</w:t>
+              <w:t>N/A</w:t>
             </w:r>
           </w:p>
         </w:tc>
@@ -1367,7 +1367,7 @@
           <w:color w:val="000000"/>
           <w:sz w:val="24"/>
         </w:rPr>
-        <w:t>Every model lands between 0.37 and 0.46 balanced accuracy on an unseen placement — the 1-D CNN is nominally best (0.46), naive Bayes and gradient boosting next (0.45, 0.44), the random forest 0.42 — but the spread is within noise. No algorithm breaks out. The ceiling here is set by the single-antenna viewpoint and the amount of data, not by the model. A fancier model does not fix cross-placement activity; a second receiver is the lever.</w:t>
+        <w:t>Every model lands between 0.37 and 0.46 balanced accuracy on an unseen placement, with the 1-D CNN nominally best (0.46), naive Bayes and gradient boosting next (0.45, 0.44), and the random forest at 0.42, but the spread is within noise. No algorithm breaks out. The ceiling here is set by the single-antenna viewpoint and the amount of data, not by the model. A fancier model does not fix cross-placement activity; a second receiver is the lever.</w:t>
       </w:r>
     </w:p>
     <w:p>
@@ -1419,7 +1419,7 @@
           <w:color w:val="000000"/>
           <w:sz w:val="24"/>
         </w:rPr>
-        <w:t>The CNN had the best walk and run recall of any model (0.67 and 0.54) yet the worst empty and sit recall — it learns movement dynamics from the raw signal but confuses an empty room with a still person. The feature-based models are the opposite: they nail empty. This is a useful pointer for combining them later.</w:t>
+        <w:t>The CNN had the best walk and run recall of any model (0.67 and 0.54) yet the worst empty and sit recall: it learns movement dynamics from the raw signal but confuses an empty room with a still person. The feature-based models are the opposite: they nail empty. This is a useful pointer for combining them later.</w:t>
       </w:r>
     </w:p>
     <w:p>
@@ -1445,7 +1445,7 @@
           <w:color w:val="000000"/>
           <w:sz w:val="24"/>
         </w:rPr>
-        <w:t>Per-install, logistic regression (0.85) and the RBF-SVM (0.83) actually beat the tree ensembles (0.79–0.80). With an on-site empty baseline the features become cleanly separable, so a light linear model is enough — no heavy model needed for the realistic deployment mode.</w:t>
+        <w:t>Per-install, logistic regression (0.85) and the RBF-SVM (0.83) actually beat the tree ensembles (0.79–0.80). With an on-site empty baseline the features become cleanly separable, so a light linear model is enough; no heavy model needed for the realistic deployment mode.</w:t>
       </w:r>
     </w:p>
     <w:p>
@@ -1501,7 +1501,7 @@
           <w:color w:val="000000"/>
           <w:sz w:val="24"/>
         </w:rPr>
-        <w:t>Keep the random forest as the default model: it is at or near the top for presence (0.84), competitive on activity, needs no feature scaling or tuning, trains in seconds, and is interpretable. The result to take away is that the current limitations are a sensing limitation, not a modeling one — no model in this sweep, including deep networks, removes the cross-placement activity wall. That is the direct argument for adding a second and third receiver rather than investing in a heavier model on a single link.</w:t>
+        <w:t>Keep the random forest as the default model: it is at or near the top for presence (0.84), competitive on activity, needs no feature scaling or tuning, trains in seconds, and is interpretable. The result to take away is that the current limitations are a sensing limitation, not a modeling one: no model in this sweep, including deep networks, removes the cross-placement activity wall. That is the direct argument for adding a second and third receiver rather than investing in a heavier model on a single link.</w:t>
       </w:r>
     </w:p>
     <w:p>

</xml_diff>